<commit_message>
Add live demo links to resume: Task Manager, CDAC Enterprise, Laundry System
</commit_message>
<xml_diff>
--- a/SURAJ_DOBALE_RESUME.docx
+++ b/SURAJ_DOBALE_RESUME.docx
@@ -417,21 +417,34 @@
             <w:color w:val="0563C1"/>
             <w:u w:val="single"/>
           </w:rPr>
-          <w:t>GitHub: https://github.com/SURYaDob/</w:t>
+          <w:t>GitHub: https://github.com/SURYaDob/task-manager-springboot</w:t>
         </w:r>
+      </w:hyperlink>
+    </w:p>
+    <w:p>
+      <w:r>
+        <w:rPr>
+          <w:rFonts w:ascii="Calibri" w:hAnsi="Calibri"/>
+          <w:sz w:val="22"/>
+        </w:rPr>
+        <w:t xml:space="preserve"/>
+      </w:r>
+      <w:r>
+        <w:rPr>
+          <w:color w:val="000000"/>
+          <w:sz w:val="22"/>
+        </w:rPr>
+        <w:t xml:space="preserve">Demo: </w:t>
+      </w:r>
+      <w:hyperlink r:id="rId18">
         <w:r>
           <w:rPr>
+            <w:rStyle w:val="Hyperlink"/>
             <w:color w:val="0563C1"/>
             <w:u w:val="single"/>
+            <w:sz w:val="22"/>
           </w:rPr>
-          <w:t>t</w:t>
-        </w:r>
-        <w:r>
-          <w:rPr>
-            <w:color w:val="0563C1"/>
-            <w:u w:val="single"/>
-          </w:rPr>
-          <w:t>ask-manager-springboot</w:t>
+          <w:t xml:space="preserve">Live Demo: Task Manager</w:t>
         </w:r>
       </w:hyperlink>
     </w:p>
@@ -481,6 +494,33 @@
     <w:p>
       <w:r>
         <w:rPr>
+          <w:rFonts w:ascii="Calibri" w:hAnsi="Calibri"/>
+          <w:sz w:val="22"/>
+        </w:rPr>
+        <w:t xml:space="preserve"/>
+      </w:r>
+      <w:r>
+        <w:rPr>
+          <w:color w:val="000000"/>
+          <w:sz w:val="22"/>
+        </w:rPr>
+        <w:t xml:space="preserve">Demo: </w:t>
+      </w:r>
+      <w:hyperlink r:id="rId17">
+        <w:r>
+          <w:rPr>
+            <w:rStyle w:val="Hyperlink"/>
+            <w:color w:val="0563C1"/>
+            <w:u w:val="single"/>
+            <w:sz w:val="22"/>
+          </w:rPr>
+          <w:t xml:space="preserve">Live Demo: CDAC Enterprise</w:t>
+        </w:r>
+      </w:hyperlink>
+    </w:p>
+    <w:p>
+      <w:r>
+        <w:rPr>
           <w:color w:val="333333"/>
           <w:sz w:val="19"/>
         </w:rPr>
@@ -518,6 +558,33 @@
             <w:u w:val="single"/>
           </w:rPr>
           <w:t>GitHub: https://github.com/SURYaDob/laundry-system</w:t>
+        </w:r>
+      </w:hyperlink>
+    </w:p>
+    <w:p>
+      <w:r>
+        <w:rPr>
+          <w:rFonts w:ascii="Calibri" w:hAnsi="Calibri"/>
+          <w:sz w:val="22"/>
+        </w:rPr>
+        <w:t xml:space="preserve"/>
+      </w:r>
+      <w:r>
+        <w:rPr>
+          <w:color w:val="000000"/>
+          <w:sz w:val="22"/>
+        </w:rPr>
+        <w:t xml:space="preserve">Demo: </w:t>
+      </w:r>
+      <w:hyperlink r:id="rId16">
+        <w:r>
+          <w:rPr>
+            <w:rStyle w:val="Hyperlink"/>
+            <w:color w:val="0563C1"/>
+            <w:u w:val="single"/>
+            <w:sz w:val="22"/>
+          </w:rPr>
+          <w:t xml:space="preserve">Live Demo: Laundry System</w:t>
         </w:r>
       </w:hyperlink>
     </w:p>

</xml_diff>

<commit_message>
Fix resume demo labels, update professional summary, add portfolio link
</commit_message>
<xml_diff>
--- a/SURAJ_DOBALE_RESUME.docx
+++ b/SURAJ_DOBALE_RESUME.docx
@@ -132,7 +132,7 @@
     </w:p>
     <w:p>
       <w:r>
-        <w:t>CDAC-certified Full Stack Java Developer with a strong track record of engineering end-to-end web applications using Spring Boot, Hibernate, MySQL, and MVC architecture. Proven ability to design RESTful APIs, implement secure authentication systems, and optimize database queries for performance. Passionate about writing clean, scalable, test-driven code and contributing to high-impact, product-driven engineering teams.</w:t>
+        <w:t>CDAC-certified Full Stack Java Developer with a proven track record of building production-ready web applications using Spring Boot, Hibernate, MySQL, and MVC architecture. Skilled in designing RESTful APIs, implementing secure authentication with Spring Security, and optimizing database queries for performance. Passionate about writing clean, scalable code and delivering impactful solutions as part of a product-driven engineering team.</w:t>
       </w:r>
     </w:p>
     <w:p>
@@ -434,7 +434,6 @@
           <w:color w:val="000000"/>
           <w:sz w:val="22"/>
         </w:rPr>
-        <w:t xml:space="preserve">Demo: </w:t>
       </w:r>
       <w:hyperlink r:id="rId18">
         <w:r>
@@ -504,7 +503,6 @@
           <w:color w:val="000000"/>
           <w:sz w:val="22"/>
         </w:rPr>
-        <w:t xml:space="preserve">Demo: </w:t>
       </w:r>
       <w:hyperlink r:id="rId17">
         <w:r>
@@ -574,7 +572,6 @@
           <w:color w:val="000000"/>
           <w:sz w:val="22"/>
         </w:rPr>
-        <w:t xml:space="preserve">Demo: </w:t>
       </w:r>
       <w:hyperlink r:id="rId16">
         <w:r>

</xml_diff>